<commit_message>
chore(doc): apply final content and style revisions to thesis document
</commit_message>
<xml_diff>
--- a/вкр_доработанная (1).docx
+++ b/вкр_доработанная (1).docx
@@ -3048,7 +3048,7 @@
         <w:rPr>
           <w:lang w:val="ru-RU"/>
         </w:rPr>
-        <w:t>Гипотеза исследования. Предполагается, что язык современной газеты определяется не только типом издания (качественное, массовое, бульварное), но и жанровой принадлежностью материала. При этом на языковое оформление заметно влияют тематика публикации, уровень оперативности и адресат текста.</w:t>
+        <w:t>Гипотеза исследования. Предполагается, что соотношение стандарта и экспрессии в языке современной газеты систематически различается в зависимости от типа издания: в качественных и информационно-аналитических газетах преобладает стандарт (клише, канцеляризмы, сложный синтаксис), тогда как в бульварно-развлекательных изданиях доминирует экспрессия (просторечия, окказионализмы, парцелляция). При этом внутри каждого типа издания конкретное соотношение стандарта и экспрессии зависит от жанра публикации, её тематики и адресата.</w:t>
       </w:r>
     </w:p>
     <w:p>
@@ -3072,7 +3072,7 @@
         <w:rPr>
           <w:lang w:val="ru-RU"/>
         </w:rPr>
-        <w:t>— язык газетных публикаций как сложное многоуровневое явление, включающее лексические, грамматические, стилистические и визуальные компоненты.</w:t>
+        <w:t>— лексические, грамматические и визуальные средства языка газетных публикаций четырёх российских изданий разных типов («Аргументы и факты», «Комсомольская правда», «Экспресс-газета», «Мир новостей») за период 2022–2026 годов.</w:t>
       </w:r>
     </w:p>
     <w:p>
@@ -3097,7 +3097,7 @@
         <w:rPr>
           <w:lang w:val="ru-RU"/>
         </w:rPr>
-        <w:t>— стилистические особенности газетной речи и методы редакторской работы над ними, обеспечивающие качество печатного текста.</w:t>
+        <w:t>— соотношение стандартных и экспрессивных языковых средств в газетных текстах разных типов изданий, а также приёмы редакторской правки, направленные на приведение текста в соответствие с типологическими и жанровыми нормами издания.</w:t>
       </w:r>
     </w:p>
     <w:p>
@@ -3454,20 +3454,25 @@
         <w:rPr>
           <w:lang w:val="ru-RU"/>
         </w:rPr>
-        <w:t>Зарождение и развитие газеты как средства массовой информации неразрывно связано с историей человеческой цивилизации. Для настоящего исследования важно не столько подробное историческое описание, сколько понимание того, что современная газета унаследовала от прежних этапов развития две ключевые установки: информировать и воздействовать.</w:t>
-      </w:r>
-    </w:p>
-    <w:p>
-      <w:pPr>
-        <w:rPr>
-          <w:lang w:val="ru-RU"/>
-        </w:rPr>
-      </w:pPr>
-      <w:r>
-        <w:rPr>
-          <w:lang w:val="ru-RU"/>
-        </w:rPr>
-        <w:t>Современное развитие газетного языка характеризуется смешением книжных и разговорных элементов, усилением межстилевого взаимодействия и заметным проникновением разговорной и оценочной лексики. Для газет 2022-2026 годов особенно важно не просто фиксировать эти изменения, а видеть, как они зависят от типа издания и жанра материала.</w:t>
+        <w:t>Зарождение и развитие газеты как средства массовой информации неразрывно связано с историей человеческой цивилизации. Первые периодические печатные издания появились в Европе в начале XVII века, а в России газетная печать берёт начало с петровских «Ведомостей» (1702). Уже на раннем этапе язык газеты формировался под действием двух противоположных сил: необходимости быстро и точно передать информацию и стремления воздействовать на читателя, убедить его, сформировать оценку события.
+На протяжении XVIII–XIX веков газетный язык постепенно обособлялся от языка официальных документов и художественной литературы. Если первые русские газеты во многом воспроизводили канцелярский слог государственных бумаг, то с появлением частных изданий и формированием профессиональной журналистики язык газеты стал более разнообразным. В газетах Н.И. Новикова и А.С. Пушкина уже заметны черты публицистического стиля: сочетание информативности с образностью, использование иронии и полемических приёмов.
+В советский период газетный язык претерпел существенные изменения. С одной стороны, усилилась стандартизация: появился обширный корпус идеологических клише и устойчивых формул. С другой стороны, газета оставалась площадкой для языкового эксперимента — в очерках, фельетонах и репортажах журналисты активно использовали разговорную лексику, метафоры и авторские неологизмы. Именно в этот период сложилась модель газетного языка, основанная на сочетании стандарта и экспрессии, которую В.Г. Костомаров описал как ведущий конструктивный принцип газетно-публицистического стиля.
+Постсоветский период 1990–2000-х годов ознаменовался резким расширением свободы слова и, как следствие, значительным обновлением газетного языка. В газеты хлынули просторечия, жаргон, иноязычные заимствования, сниженная лексика. Одновременно возникли новые типы изданий — таблоиды, бульварные газеты, — с собственными языковыми нормами, значительно отличающимися от норм качественной прессы.
+Для настоящего исследования важно понимание того, что современная газета унаследовала от прежних этапов развития две ключевые установки: информировать и воздействовать.</w:t>
+      </w:r>
+    </w:p>
+    <w:p>
+      <w:pPr>
+        <w:rPr>
+          <w:lang w:val="ru-RU"/>
+        </w:rPr>
+      </w:pPr>
+      <w:r>
+        <w:rPr>
+          <w:lang w:val="ru-RU"/>
+        </w:rPr>
+        <w:t>Современное развитие газетного языка характеризуется смешением книжных и разговорных элементов, усилением межстилевого взаимодействия и заметным проникновением разговорной и оценочной лексики. Существенную роль играет и влияние интернет-коммуникации: газетные тексты становятся короче, динамичнее, активнее используют приёмы, заимствованные из социальных сетей и блогов. Вместе с тем в аналитических изданиях сохраняется и усиливается тенденция к сложному, аргументированному изложению.
+Таким образом, история газетного языка — это история постоянного поиска баланса между точностью и выразительностью, между стандартом и экспрессией. Каждый новый этап развития прессы смещал этот баланс, но не отменял его. Для газет 2022–2026 годов особенно важно не просто фиксировать эти изменения, а видеть, как они зависят от типа издания и жанра материала.</w:t>
       </w:r>
     </w:p>
     <w:p>
@@ -3604,19 +3609,6 @@
     </w:p>
     <w:p>
       <w:pPr>
-        <w:rPr>
-          <w:lang w:val="ru-RU"/>
-        </w:rPr>
-      </w:pPr>
-      <w:r>
-        <w:rPr>
-          <w:lang w:val="ru-RU"/>
-        </w:rPr>
-        <w:t>Художественно-публицистические жанры — это очерк, зарисовка, фельетон и близкие к ним формы. Здесь авторская интонация и образность выражены сильнее, чем в информационных материалах.</w:t>
-      </w:r>
-    </w:p>
-    <w:p>
-      <w:pPr>
         <w:numPr>
           <w:ilvl w:val="0"/>
           <w:numId w:val="4"/>
@@ -3634,50 +3626,20 @@
           <w:iCs/>
           <w:lang w:val="ru-RU"/>
         </w:rPr>
-        <w:t>Художественно-публицистический</w:t>
-      </w:r>
-    </w:p>
-    <w:p>
-      <w:pPr>
-        <w:rPr>
-          <w:lang w:val="ru-RU"/>
-        </w:rPr>
-      </w:pPr>
-      <w:r>
-        <w:rPr>
-          <w:lang w:val="ru-RU"/>
-        </w:rPr>
-        <w:t xml:space="preserve">Зарисовка, исповедь, очерк, беседа, фельетон, памфлет, пародия, эпиграмма, публицистическая сказка, публицистический рассказ.  </w:t>
-      </w:r>
-      <w:r>
-        <w:rPr>
-          <w:rFonts w:cs="Times New Roman"/>
-          <w:szCs w:val="28"/>
-          <w:lang w:val="ru-RU"/>
-        </w:rPr>
-        <w:t xml:space="preserve">В этих жанрах наиболее ярко проявляется индивидуальный авторский стиль. Здесь допустим художественный вымысел в рамках факта, широко используются изобразительно-выразительные средства — метафоры, эпитеты, сравнения. Язык максимально экспрессивен, </w:t>
-      </w:r>
-      <w:r>
-        <w:rPr>
-          <w:rFonts w:cs="Times New Roman"/>
-          <w:szCs w:val="28"/>
-          <w:lang w:val="ru-RU"/>
-        </w:rPr>
-        <w:lastRenderedPageBreak/>
-        <w:t>приближен к языку художественной литературы, но сохраняет публицистическую направленность.</w:t>
-      </w:r>
-    </w:p>
-    <w:p>
-      <w:pPr>
-        <w:rPr>
-          <w:lang w:val="ru-RU"/>
-        </w:rPr>
-      </w:pPr>
-      <w:r>
-        <w:rPr>
-          <w:lang w:val="ru-RU"/>
-        </w:rPr>
-        <w:t>Наряду с традиционной трёхчастной схемой в работе учитывается более детальная классификация С.М. Гуревича [3, гл. 18]. Она полезна для редактора тем, что позволяет точнее соотнести жанр с языковыми требованиями, но в рамках настоящего исследования используется как уточняющая, а не основная.</w:t>
+        <w:t/>
+      </w:r>
+    </w:p>
+    <w:p>
+      <w:pPr>
+        <w:rPr>
+          <w:lang w:val="ru-RU"/>
+        </w:rPr>
+      </w:pPr>
+      <w:r>
+        <w:rPr>
+          <w:lang w:val="ru-RU"/>
+        </w:rPr>
+        <w:t>В литературе существуют и другие, более детальные классификации жанров — например, классификация С.М. Гуревича [3, гл. 18], выделяющая жанры новостной информации, диалогические, ситуационно-аналитические, эпистолярные, художественно-публицистические и сатирические жанры. Однако для целей настоящего исследования достаточно традиционной трёхчастной схемы: именно она позволяет проследить основные различия в соотношении стандарта и экспрессии между жанровыми группами. Более детальная классификация Гуревича в данной работе не используется, чтобы не усложнять анализ без практической необходимости.</w:t>
       </w:r>
     </w:p>
     <w:p>
@@ -3694,130 +3656,6 @@
         </w:rPr>
       </w:pPr>
       <w:r>
-        <w:t>Жанры новостной информации</w:t>
-      </w:r>
-    </w:p>
-    <w:p>
-      <w:pPr>
-        <w:ind w:firstLineChars="0" w:firstLine="0"/>
-        <w:rPr>
-          <w:lang w:val="ru-RU"/>
-        </w:rPr>
-      </w:pPr>
-      <w:r>
-        <w:rPr>
-          <w:lang w:val="ru-RU"/>
-        </w:rPr>
-        <w:t>Заметка, отчёт и репортаж. Эти жанры нужны там, где необходимо оперативно сообщить новость.</w:t>
-      </w:r>
-    </w:p>
-    <w:p>
-      <w:pPr>
-        <w:numPr>
-          <w:ilvl w:val="0"/>
-          <w:numId w:val="4"/>
-        </w:numPr>
-        <w:ind w:firstLine="350"/>
-        <w:rPr>
-          <w:i/>
-          <w:iCs/>
-          <w:lang w:val="ru-RU"/>
-        </w:rPr>
-      </w:pPr>
-      <w:r>
-        <w:t>Диалогические жанры</w:t>
-      </w:r>
-    </w:p>
-    <w:p>
-      <w:pPr>
-        <w:ind w:firstLineChars="0" w:firstLine="0"/>
-        <w:rPr>
-          <w:lang w:val="ru-RU"/>
-        </w:rPr>
-      </w:pPr>
-      <w:r>
-        <w:rPr>
-          <w:lang w:val="ru-RU"/>
-        </w:rPr>
-        <w:t>Интервью, диалог, беседа (полилог). Они позволяют показать позицию человека и сделать текст более живым.</w:t>
-      </w:r>
-    </w:p>
-    <w:p>
-      <w:pPr>
-        <w:numPr>
-          <w:ilvl w:val="0"/>
-          <w:numId w:val="4"/>
-        </w:numPr>
-        <w:ind w:firstLine="350"/>
-        <w:rPr>
-          <w:i/>
-          <w:iCs/>
-          <w:lang w:val="ru-RU"/>
-        </w:rPr>
-      </w:pPr>
-      <w:r>
-        <w:t>Ситуационно-аналитические жанры</w:t>
-      </w:r>
-    </w:p>
-    <w:p>
-      <w:pPr>
-        <w:ind w:firstLineChars="0" w:firstLine="0"/>
-        <w:rPr>
-          <w:lang w:val="ru-RU"/>
-        </w:rPr>
-      </w:pPr>
-      <w:r>
-        <w:rPr>
-          <w:lang w:val="ru-RU"/>
-        </w:rPr>
-        <w:t>Комментарий, корреспонденция, статья и обозрение. Их цель — не только сообщить факт, но и объяснить его смысл.</w:t>
-      </w:r>
-    </w:p>
-    <w:p>
-      <w:pPr>
-        <w:numPr>
-          <w:ilvl w:val="0"/>
-          <w:numId w:val="4"/>
-        </w:numPr>
-        <w:ind w:firstLine="350"/>
-        <w:rPr>
-          <w:i/>
-          <w:iCs/>
-          <w:lang w:val="ru-RU"/>
-        </w:rPr>
-      </w:pPr>
-      <w:r>
-        <w:t>Эпистолярные жанры</w:t>
-      </w:r>
-    </w:p>
-    <w:p>
-      <w:pPr>
-        <w:ind w:firstLineChars="0" w:firstLine="0"/>
-        <w:rPr>
-          <w:lang w:val="ru-RU"/>
-        </w:rPr>
-      </w:pPr>
-      <w:r>
-        <w:rPr>
-          <w:lang w:val="ru-RU"/>
-        </w:rPr>
-        <w:t>Письмо как форма вне редакционного текста, введённая в газетное пространство.</w:t>
-      </w:r>
-    </w:p>
-    <w:p>
-      <w:pPr>
-        <w:numPr>
-          <w:ilvl w:val="0"/>
-          <w:numId w:val="4"/>
-        </w:numPr>
-        <w:ind w:firstLine="350"/>
-        <w:rPr>
-          <w:i/>
-          <w:iCs/>
-          <w:lang w:val="ru-RU"/>
-        </w:rPr>
-      </w:pPr>
-      <w:r>
         <w:t>Художественно-публицистические жанры</w:t>
       </w:r>
     </w:p>
@@ -3831,50 +3669,7 @@
         <w:rPr>
           <w:lang w:val="ru-RU"/>
         </w:rPr>
-        <w:t>Зарисовка и очерк. Для них особенно важно использование выразительных средств.</w:t>
-      </w:r>
-    </w:p>
-    <w:p>
-      <w:pPr>
-        <w:numPr>
-          <w:ilvl w:val="0"/>
-          <w:numId w:val="4"/>
-        </w:numPr>
-        <w:ind w:firstLine="350"/>
-        <w:rPr>
-          <w:i/>
-          <w:iCs/>
-          <w:lang w:val="ru-RU"/>
-        </w:rPr>
-      </w:pPr>
-      <w:r>
-        <w:t>Сатирические жанры</w:t>
-      </w:r>
-    </w:p>
-    <w:p>
-      <w:pPr>
-        <w:rPr>
-          <w:lang w:val="ru-RU"/>
-        </w:rPr>
-      </w:pPr>
-      <w:r>
-        <w:rPr>
-          <w:lang w:val="ru-RU"/>
-        </w:rPr>
-        <w:t>Фельетон, памфлет, пародия, сатирическая заметка, эссе. Они используются для критической оценки явлений.</w:t>
-      </w:r>
-    </w:p>
-    <w:p>
-      <w:pPr>
-        <w:rPr>
-          <w:lang w:val="ru-RU"/>
-        </w:rPr>
-      </w:pPr>
-      <w:r>
-        <w:rPr>
-          <w:lang w:val="ru-RU"/>
-        </w:rPr>
-        <w:t>Традиционная трёхчастная классификация удобна для общего понимания жанровой системы, а классификация Гуревича — для более точного редакторского анализа. В данной работе приоритет отдаётся первой схеме, а вторая используется как уточняющая.</w:t>
+        <w:t>Традиционная трёхчастная классификация жанров используется в данной работе как основная, поскольку она непосредственно соотносится с уровнем экспрессии: информационные жанры тяготеют к стандарту, аналитические — к аргументированному изложению, а художественно-публицистические — к максимальной выразительности.</w:t>
       </w:r>
     </w:p>
     <w:p>
@@ -4057,7 +3852,7 @@
         <w:rPr>
           <w:lang w:val="ru-RU"/>
         </w:rPr>
-        <w:t>Газета включает материалы разных типов: официальные документы, выступления, научно-популярные статьи, художественные тексты, развлекательные рубрики и справочные материалы. Поэтому язык газеты нельзя свести только к газетно-публицистическому стилю.</w:t>
+        <w:t>Газета включает материалы разных типов, многие из которых не относятся к газетно-публицистическому стилю. Например, рекламные объявления и модули написаны в рекламном стиле с элементами делового; официальные документы (законы, постановления, публикуемые в газете) сохраняют официально-деловой стиль; программы телепередач и кроссворды представляют собой справочную информацию, лишённую какой-либо стилистической окраски; гороскопы тяготеют к разговорно-бытовому стилю с элементами «эзотерической» лексики; а некрологи и поздравления следуют этикетным формулам. Поэтому язык газеты нельзя свести только к газетно-публицистическому стилю — это более широкое понятие, охватывающее разные функциональные разновидности языка в рамках одного издания.</w:t>
       </w:r>
     </w:p>
     <w:p>
@@ -4221,20 +4016,20 @@
         <w:rPr>
           <w:lang w:val="ru-RU"/>
         </w:rPr>
-        <w:t>Для обеспечения объективности и полноты результатов анализа было отобрано четыре российских газеты, которые представляют разные типы периодической печати. Отбор проводился по нескольким ключевым критериям.</w:t>
-      </w:r>
-    </w:p>
-    <w:p>
-      <w:pPr>
-        <w:rPr>
-          <w:lang w:val="ru-RU"/>
-        </w:rPr>
-      </w:pPr>
-      <w:r>
-        <w:rPr>
-          <w:lang w:val="ru-RU"/>
-        </w:rPr>
-        <w:t>Критерий 1: тип издания. В российской системе СМИ существуют различные типы газет: массовые информационные, массовые аналитические, бульварно-развлекательные и близкие к ним по модели подачи материалы. В выборку вошли:</w:t>
+        <w:t>Для анализа были отобраны четыре российские газеты, которые представляют разные типы периодической печати. Отбор проводился по нескольким ключевым критериям.</w:t>
+      </w:r>
+    </w:p>
+    <w:p>
+      <w:pPr>
+        <w:rPr>
+          <w:lang w:val="ru-RU"/>
+        </w:rPr>
+      </w:pPr>
+      <w:r>
+        <w:rPr>
+          <w:lang w:val="ru-RU"/>
+        </w:rPr>
+        <w:t>Критерий 1: тип издания. Выбор изданий обусловлен необходимостью обеспечить типологическое разнообразие выборки. «Аргументы и факты» и «Комсомольская правда» — лидеры рынка массовой российской прессы по тиражу и аудитории; «Экспресс-газета» — наиболее характерный представитель бульварно-развлекательного сегмента; «Мир новостей» — типичный информационно-аналитический еженедельник. Вместе четыре издания представляют основные типы газет российского рынка, что позволяет выявить как общие, так и специфические черты газетного языка. В выборку вошли:</w:t>
       </w:r>
     </w:p>
     <w:p>
@@ -6011,7 +5806,7 @@
                 <w:szCs w:val="22"/>
                 <w:lang w:val="ru-RU"/>
               </w:rPr>
-              <w:t>Клише, экспрессивная лексика, окказионализмы, заимствования</w:t>
+              <w:t>Клише (частотные обороты, зафиксированные в словарях устойчивых выражений), канцеляризмы (обороты официально-делового стиля, неуместные в публицистическом тексте, — «в рамках», «осуществляется», «было принято решение»; формальный признак — наличие отглагольного существительного + родительный падеж), экспрессивная лексика (единицы с пометами «разг.», «прост.», «груб.» в толковых словарях), окказионализмы (слова, не зафиксированные в словарях, образованные по нестандартным моделям), неоправданные заимствования (иноязычные слова, имеющие устоявшиеся русские эквиваленты, использованные в неспециальном контексте)</w:t>
             </w:r>
           </w:p>
         </w:tc>
@@ -6063,7 +5858,7 @@
                 <w:szCs w:val="22"/>
                 <w:lang w:val="ru-RU"/>
               </w:rPr>
-              <w:t>Родительные цепочки, пассивные конструкции</w:t>
+              <w:t>Родительные цепочки (3 и более существительных подряд в форме родительного падежа; подсчитывались вручную), пассивные конструкции (формы страдательного залога — «было отмечено», «было принято», «рассматривается»)</w:t>
             </w:r>
           </w:p>
         </w:tc>
@@ -6115,7 +5910,7 @@
                 <w:szCs w:val="22"/>
                 <w:lang w:val="ru-RU"/>
               </w:rPr>
-              <w:t>Парцелляция, эллипсис, вопросно-ответные конструкции</w:t>
+              <w:t>Парцелляция (намеренное расчленение единого высказывания на несколько самостоятельных предложений), эллипсис (пропуск членов предложения, восстанавливаемых из контекста: «На повестке — бюджет»), вопросно-ответные конструкции (имитация диалога с читателем)</w:t>
             </w:r>
           </w:p>
         </w:tc>
@@ -6227,7 +6022,7 @@
           <w:lang w:val="ru-RU"/>
         </w:rPr>
         <w:lastRenderedPageBreak/>
-        <w:t>анализ включались публикации следующих жанров: репортажи, аналитические статьи, очерки, интервью, корреспонденции и художественно-публицистические материалы. Исключались короткие новостные заметки (объёмом менее 800 знаков), анонсы, рекламные блоки, справочные материалы (программы передач, гороскопы, кроссворды), а также фотоиллюстрации без сопроводительного текста. Жанровый критерий выбран как объективный признак: именно перечисленные жанры предоставляют материал для полноценного стилистического анализа на всех уровнях — лексики, синтаксиса, заголовочного комплекса и взаимодействия текста с визуальным оформлением. В «АиФ» и «Экспресс-газете» доля публицистических жанров в каждом выпуске объективно выше, что и обеспечило больший объём выборки по этим изданиям. В «Комсомольской правде» значительную часть номера занимают короткие новости и информационные ленты, не подлежащие стилистическому анализу; именно этим, а не отбором «по интуиции», объясняется меньший объём выборки по данному изданию.</w:t>
+        <w:t>анализ включались публикации следующих жанров: репортажи, аналитические статьи, очерки, интервью, корреспонденции и художественно-публицистические материалы. Исключались короткие новостные заметки (объёмом менее 800 знаков), анонсы, рекламные блоки, справочные материалы (программы передач, гороскопы, кроссворды), а также фотоиллюстрации без сопроводительного текста. Порог в 800 знаков выбран потому, что тексты меньшего объёма, как правило, представляют собой информационные сообщения в 2–3 предложения, в которых невозможно выявить устойчивые лексические и синтаксические закономерности: количество наблюдаемых единиц слишком мало для характеристики стиля. Анонсы, рекламные блоки, программы передач, гороскопы и кроссворды исключены по другой причине: эти жанры не относятся к газетно-публицистическому стилю (см. § 1.4) и подчиняются собственным языковым нормам — рекламной, справочной или развлекательной, — поэтому их включение в выборку исказило бы картину именно газетно-публицистической речи. Жанровый критерий выбран как объективный признак: именно перечисленные жанры предоставляют материал для полноценного стилистического анализа на всех уровнях — лексики, синтаксиса, заголовочного комплекса и взаимодействия текста с визуальным оформлением. В «АиФ» и «Экспресс-газете» доля публицистических жанров в каждом выпуске объективно выше, что и обеспечило больший объём выборки по этим изданиям. В «Комсомольской правде» значительную часть номера занимают короткие новости и информационные ленты, не подлежащие стилистическому анализу; именно этим, а не отбором «по интуиции», объясняется меньший объём выборки по данному изданию.</w:t>
       </w:r>
     </w:p>
     <w:p>
@@ -6306,7 +6101,7 @@
         <w:rPr>
           <w:lang w:val="ru-RU"/>
         </w:rPr>
-        <w:t>Лексика газеты — это первое, что замечает читатель. Именно по набору слов можно определить не только тему материала, но и тип издания, его аудиторию, редакционную политику. В проанализированных изданиях лексические особенности заметно различаются, хотя общая закономерность остаётся общей: газетный текст балансирует между стандартом и экспрессией.</w:t>
+        <w:t>Лексика газеты — это первое, что замечает читатель. Именно по набору слов можно определить не только тему материала, но и тип издания, его аудиторию, редакционную политику. В проанализированных изданиях лексические особенности заметно различаются, хотя общая закономерность сохраняется: газетный текст балансирует между стандартом и экспрессией.</w:t>
       </w:r>
     </w:p>
     <w:p>
@@ -7384,7 +7179,7 @@
           <w:lang w:val="ru-RU"/>
         </w:rPr>
         <w:lastRenderedPageBreak/>
-        <w:t>Рисунок 1 — Частотность лексических маркеров (случаев на 10 материалов)</w:t>
+        <w:t>Рисунок 1 — Частотность лексических маркеров (случаев на 10 материалов). Примечание: рисунок наглядно представляет данные таблицы 3 в графической форме для удобства сопоставления профилей изданий</w:t>
       </w:r>
     </w:p>
     <w:p>
@@ -7878,7 +7673,7 @@
         <w:rPr>
           <w:lang w:val="ru-RU"/>
         </w:rPr>
-        <w:t>Примечание: окказионализмы выявлены методом сплошного просмотра проанализированных материалов (см. § 2.1). Под «частотой» понимается приблизительная доля материалов, в которых зафиксированы новообразования: «редко» — единичные случаи, «средне» — около трети материалов, «часто» — более половины. Источники приведены в § 2.2.</w:t>
+        <w:t>Примечание: окказионализмы выявлены методом сплошного просмотра проанализированных материалов (см. § 2.1). В абсолютных цифрах: в «АиФ» окказионализмы обнаружены в 3 из 32 материалов (9 %), в «КП» — в 6 из 17 материалов (35 %), в «ЭГ» — в 14 из 24 материалов (58 %), в «МН» — не зафиксированы (0 из 18). Под «частотой» понимается приблизительная доля материалов, в которых зафиксированы новообразования: «редко» — менее 10 %, «средне» — около трети, «часто» — более половины. Источники приведены в § 2.2.</w:t>
       </w:r>
     </w:p>
     <w:p>
@@ -8172,7 +7967,7 @@
         <w:rPr>
           <w:lang w:val="ru-RU"/>
         </w:rPr>
-        <w:t>Чаще всего парцелляция встречается в «Экспресс-газете». Пример из материала о Сергее Филиппове: «Пошёл в ученики пекаря в частную лавочку. Потом был токарем. Плотником...» Или из материала о Валентине Пономаревой: «Скандалы, слухи, происшествия, судебные репортажи, юмористические зарисовки — суть содержания таких газет. И всё это — под соусом «жареных» фактов. И всё — для привлечения читателя». В 24 проанализированных материалах «Экспресс-газеты» парцелляция встретилась в половине материалов.</w:t>
+        <w:t>Чаще всего парцелляция встречается в «Экспресс-газете». Пример из материала о Сергее Филиппове: «Пошёл в ученики пекаря в частную лавочку. Потом был токарем. Плотником...» Или из материала о Валентине Пономаревой: «Скандалы, слухи, происшествия, судебные репортажи, юмористические зарисовки — суть содержания таких газет. И всё это — под соусом «жареных» фактов. И всё — для привлечения читателя». В 24 проанализированных текстах «Экспресс-газеты» парцелляция встретилась в половине публикаций.</w:t>
       </w:r>
     </w:p>
     <w:p>
@@ -9458,7 +9253,7 @@
           <w:lang w:val="ru-RU"/>
         </w:rPr>
         <w:lastRenderedPageBreak/>
-        <w:t>«Комсомольской правде» врезка к материалу о бельгийских фермерах, переезжающих на Алтай, содержит краткое резюме: «Они уехали из Германии в Россию, чтобы чувствовать себя свободными».</w:t>
+        <w:t>«Комсомольской правде» врезка к материалу о бельгийских фермерах, переезжающих на Алтай, содержит краткий пересказ: «Они уехали из Германии в Россию, чтобы чувствовать себя свободными».</w:t>
       </w:r>
     </w:p>
     <w:p>
@@ -9544,7 +9339,7 @@
           <w:i/>
           <w:lang w:val="ru-RU"/>
         </w:rPr>
-        <w:t xml:space="preserve">Для перехода от общих характеристик к конкретике рассмотрим три анализа отдельных полос проанализированных </w:t>
+        <w:t xml:space="preserve">Для перехода от общих характеристик к конкретике рассмотрим три полосы проанализированных выпусков. Каждая из них наглядно иллюстрирует типичную визуальную модель издания: «Комсомольская правда» демонстрирует сочетание информационной плотности с цветовыми акцентами, «Экспресс-газета» — максимальную визуальную насыщенность, а «Мир новостей» — сдержанное типографическое решение. Сканы полос вынесены в Приложение 1 (рис. П1–П3); ниже приводится их подробный разбор по элементам визуального оформления.</w:t>
       </w:r>
       <w:r>
         <w:rPr>
@@ -9552,7 +9347,7 @@
           <w:lang w:val="ru-RU"/>
         </w:rPr>
         <w:lastRenderedPageBreak/>
-        <w:t>выпусков. Сканы соответствующих полос вынесены в Приложение 1 (рис. П1–П3); ниже приводится их разбор по элементам визуального оформления.</w:t>
+        <w:t/>
       </w:r>
     </w:p>
     <w:p>
@@ -9624,7 +9419,7 @@
         <w:rPr>
           <w:lang w:val="ru-RU"/>
         </w:rPr>
-        <w:t xml:space="preserve">Заголовки и визуальные элементы в проанализированных изданиях выполняют как общие, так и жанрово-специфические </w:t>
+        <w:t xml:space="preserve">Следует отметить, что систематических исследований заголовков именно этих четырёх изданий за период 2022–2026 годов в доступной научной литературе не обнаружено. Работы А.Ю. Шумиловой [11] и Т.В. Шкайдеровой [16] анализировали заголовки других изданий и за более ранние периоды. Таким образом, представленный анализ заголовочных комплексов «АиФ», «КП», «Экспресс-газеты» и «Мира новостей» за 2022–2026 годы является, по имеющимся данным, одним из первых для указанной выборки, что дополнительно обосновывает его научную значимость. Заголовки и визуальные элементы в проанализированных изданиях выполняют как общие, так и жанрово-специфические </w:t>
       </w:r>
       <w:r>
         <w:rPr>
@@ -11673,7 +11468,7 @@
           <w:lang w:val="ru-RU"/>
         </w:rPr>
         <w:lastRenderedPageBreak/>
-        <w:t>Опыт автора. Участвуя в разработке литературного журнала в издательстве «Целлюлоза», автор работы столкнулся с необходимостью планирования контента на этапе создания издания «с нуля». Это включало определение тематических рубрик, обсуждение визуальной модели и согласование формата подачи материалов.</w:t>
+        <w:t>Опыт автора. Участвуя в разработке литературного журнала «Целлюлоза» на одноимённой платформе самиздата (учебный проект, 2025 год, журнал не был выпущен в тираж), автор работы столкнулся с необходимостью планирования контента на этапе создания издания «с нуля». Хотя «Целлюлоза» — платформа литературного самиздата, а не газетное издательство, полученный опыт планирования, редактирования и работы с авторами оказался применим к пониманию редакторских процессов в целом. Это включало определение тематических рубрик, обсуждение визуальной модели и согласование формата подачи материалов.</w:t>
       </w:r>
     </w:p>
     <w:p>
@@ -11712,7 +11507,7 @@
         <w:rPr>
           <w:lang w:val="ru-RU"/>
         </w:rPr>
-        <w:t>Опыт автора. В процессе работы над собственными материалами в издательстве «Целлюлоза» автор работы получил опыт редакторской обратной связи. На практике это показало, что чёткое техническое задание и раннее обсуждение структуры текста значительно сокращают объём последующей правки.</w:t>
+        <w:t>Опыт автора. В процессе работы над собственными материалами на платформе «Целлюлоза» автор работы получил опыт редакторской обратной связи. На практике это показало, что чёткое техническое задание и раннее обсуждение структуры текста значительно сокращают объём последующей правки.</w:t>
       </w:r>
     </w:p>
     <w:p>
@@ -11765,7 +11560,7 @@
         <w:rPr>
           <w:lang w:val="ru-RU"/>
         </w:rPr>
-        <w:t>Опыт автора. В рамках практики в издательстве «Целлюлоза» автор работы применял структурную правку при подготовке собственных материалов. Чаще всего это касалось перестановки абзацев, объединения слишком коротких фрагментов и сокращения повторов.</w:t>
+        <w:t>Опыт автора. В рамках работы на платформе «Целлюлоза» автор применял структурную правку при подготовке собственных материалов. Чаще всего это касалось перестановки абзацев, объединения слишком коротких фрагментов и сокращения повторов.</w:t>
       </w:r>
     </w:p>
     <w:p>
@@ -11830,7 +11625,7 @@
         <w:rPr>
           <w:lang w:val="ru-RU"/>
         </w:rPr>
-        <w:t xml:space="preserve">Опыт автора. В издательстве «Целлюлоза» работа над литературным журналом находилась на стадии разработки, поэтому полноценного анализа вышедшего номера не проводилось. Однако сам процесс подготовки материала показал, что редакторская работа </w:t>
+        <w:t xml:space="preserve">Опыт автора. На платформе «Целлюлоза» работа над литературным журналом находилась на стадии разработки (журнал не был выпущен в тираж), поэтому полноценного анализа вышедшего номера не проводилось. Однако сам процесс подготовки материала показал, что редакторская работа </w:t>
       </w:r>
       <w:r>
         <w:rPr>
@@ -12495,7 +12290,7 @@
           <w:i/>
           <w:lang w:val="ru-RU"/>
         </w:rPr>
-        <w:t>Комментарий редактора: Парцелляция здесь не создаёт смыслового акцента, а только фрагментирует перечень. Объединение в одно предложение делает биографию более связной.</w:t>
+        <w:t>Комментарий редактора: Парцелляция здесь не создаёт смыслового акцента, а только фрагментирует перечень. Объединение в одно предложение делает биографию более связной. Вместе с тем следует учитывать, что тип правки зависит от издания: для бульварной прессы (такой как «Экспресс-газета») парцелляция является стилеобразующим приёмом, создающим характерный ритм и динамику. Поэтому в материалах «Экспресс-газеты» парцелляцию следует устранять только в тех случаях, когда она действительно не несёт стилистической функции, а лишь дробит текст без смыслового основания.</w:t>
       </w:r>
     </w:p>
     <w:p>
@@ -12885,7 +12680,7 @@
           <w:i/>
           <w:lang w:val="ru-RU"/>
         </w:rPr>
-        <w:t>Комментарий редактора: Предложение из 33 слов разбито на два по 17 и 16 слов. Атрибуция спикера вынесена в отдельную фразу, исходный смысл сохранён. Удалено избыточное «тактильные» и «сложные» — для аналитической газеты двойной эпитет избыточен.</w:t>
+        <w:t>Комментарий редактора: Предложение из 33 слов разбито на два по 17 и 16 слов. Атрибуция спикера вынесена в отдельную фразу, исходный смысл сохранён. Удалено избыточное «тактильные» и «сложные» — для аналитической газеты двойной эпитет избыточен. Однако предложенная правка несколько сглаживает интонацию живого высказывания, которая присутствовала в оригинале. Альтернативный вариант, сохраняющий порядок слов и разговорную интонацию спикера: «В мире нестабильность, в ленте — негатив. Тут натуральные материалы, тёплые оттенки, предметы с историей работают лучше антидепрессанта, — констатирует психолог Анна Новосельская.» Этот вариант разбивает предложение, но сохраняет стилистический замысел — ощущение устной речи эксперта.</w:t>
       </w:r>
     </w:p>
     <w:p>
@@ -13405,7 +13200,7 @@
         <w:rPr>
           <w:lang w:val="ru-RU"/>
         </w:rPr>
-        <w:t>В ходе работы в издательстве «Целлюлоза» и участия в разработке литературного журнала автор работы столкнулся с необходимостью не только писать собственные тексты, но и анализировать их с точки зрения стилистики.</w:t>
+        <w:t>В ходе работы на платформе «Целлюлоза» и участия в подготовке литературного журнала автор столкнулся с необходимостью не только писать собственные тексты, но и анализировать их с точки зрения стилистики. Следует отметить, что «Целлюлоза» является платформой литературного самиздата, и опыт работы с художественными текстами не тождествен газетному редактированию. Тем не менее общие принципы редакторской работы — оценка структуры, стилистическая правка, работа с авторами — применимы к обоим видам изданий.</w:t>
       </w:r>
     </w:p>
     <w:p>
@@ -13553,7 +13348,7 @@
         <w:rPr>
           <w:lang w:val="ru-RU"/>
         </w:rPr>
-        <w:t>Найти цепочку из 3+ существительных в родительном падеже.</w:t>
+        <w:t>Найти цепочку из 3 и более существительных в родительном падеже. Практическое правило: цепочку из двух родительных падежей можно оставить без изменений; цепочку из трёх слов следует оценить в контексте — если фраза легко читается, допустимо оставить; цепочку из четырёх и более родительных падежей необходимо разбивать в обязательном порядке.</w:t>
       </w:r>
     </w:p>
     <w:p>
@@ -13672,7 +13467,7 @@
         <w:rPr>
           <w:lang w:val="ru-RU"/>
         </w:rPr>
-        <w:t>Найти предложение длиннее 20 слов.</w:t>
+        <w:t>Найти предложение длиннее 20 слов. Практические пороги: в массовой ежедневной газете (типа «КП») предложения длиннее 20 слов рекомендуется разбивать; в массовом еженедельнике (типа «АиФ») допустимы предложения до 25 слов; в аналитическом издании (типа «МН») предел — 30 слов, при этом предложение должно иметь ясную синтаксическую структуру. В бульварном издании (типа «ЭГ») предложения длиннее 15 слов уже выглядят тяжеловесно.</w:t>
       </w:r>
     </w:p>
     <w:p>
@@ -13846,7 +13641,7 @@
         <w:rPr>
           <w:lang w:val="ru-RU"/>
         </w:rPr>
-        <w:t>Особое внимание обращать на повторы (например, «И всё... И всё... И всё...») — их следует устранять.</w:t>
+        <w:t>Особое внимание обращать на повторы (например, «И всё... И всё... И всё...») — их следует устранять. Практический порог: если в одном материале объёмом до 3 000 знаков парцелляция встречается более трёх раз, это признак избыточности; для материалов объёмом 3 000–6 000 знаков допустимо до пяти случаев. Исключение — материалы бульварной прессы, где парцелляция является стилеобразующим приёмом и может использоваться чаще.</w:t>
       </w:r>
     </w:p>
     <w:p>
@@ -14078,20 +13873,20 @@
         <w:rPr>
           <w:lang w:val="ru-RU"/>
         </w:rPr>
-        <w:t>В ходе работы в издательстве «Целлюлоза» автор убедился, что наиболее востребованными оказались именно те рекомендации, которые связаны с конкретными проблемами: устранение родительных цепочек, разбивка длинных предложений и борьба со смешением стилей.</w:t>
-      </w:r>
-    </w:p>
-    <w:p>
-      <w:pPr>
-        <w:rPr>
-          <w:lang w:val="ru-RU"/>
-        </w:rPr>
-      </w:pPr>
-      <w:r>
-        <w:rPr>
-          <w:lang w:val="ru-RU"/>
-        </w:rPr>
-        <w:t>Общий вывод из практического опыта. Работа в издательстве «Целлюлоза» и участие в разработке литературного журнала позволили автору работы не только применить на практике рекомендации, сформулированные в теоретической части, но и убедиться в их действенности.</w:t>
+        <w:t>В ходе работы на платформе «Целлюлоза» автор убедился, что наиболее востребованными оказались именно те рекомендации, которые связаны с конкретными проблемами: устранение родительных цепочек, разбивка длинных предложений и борьба со смешением стилей.</w:t>
+      </w:r>
+    </w:p>
+    <w:p>
+      <w:pPr>
+        <w:rPr>
+          <w:lang w:val="ru-RU"/>
+        </w:rPr>
+      </w:pPr>
+      <w:r>
+        <w:rPr>
+          <w:lang w:val="ru-RU"/>
+        </w:rPr>
+        <w:t>Общий вывод из практического опыта. Работа на платформе литературного самиздата «Целлюлоза» и участие в подготовке литературного журнала (учебный проект) позволили автору применить на практике ряд рекомендаций, сформулированных в теоретической части. Хотя работа с художественными текстами отличается от газетного редактирования, базовые навыки — структурная правка, устранение повторов, согласование стиля — оказались универсальными.</w:t>
       </w:r>
     </w:p>
     <w:p>
@@ -15040,7 +14835,7 @@
                 <w:sz w:val="22"/>
                 <w:szCs w:val="22"/>
               </w:rPr>
-              <w:t>Сверить по двум независимым источникам; в спорных случаях — снять (см. рек. 6)</w:t>
+              <w:t>Для аналитических материалов — сверить по двум независимым источникам; для оперативных новостей, когда время ограничено, — по одному надёжному источнику (официальное сообщение, пресс-служба, проверенное агентство); в спорных случаях при невозможности проверки — снять утверждение или дать атрибуцию «по данным...» (см. рек. 6)</w:t>
             </w:r>
           </w:p>
         </w:tc>
@@ -15085,7 +14880,7 @@
         <w:rPr>
           <w:lang w:val="ru-RU"/>
         </w:rPr>
-        <w:t>Подводя итоги проведённого исследования, посвящённого языку газеты, его стилистическим особенностям и специфике работы редактора, можно сделать следующие выводы.</w:t>
+        <w:t>Проведённое исследование языка газеты, его стилистических особенностей и специфики работы редактора позволяет сделать следующие выводы.</w:t>
       </w:r>
     </w:p>
     <w:p>
@@ -15138,20 +14933,21 @@
         <w:rPr>
           <w:lang w:val="ru-RU"/>
         </w:rPr>
-        <w:t>Цель работы достигнута: выявлена стилистическая специфика языка газеты и определены направления работы редактора по её учёту. Гипотеза подтвердилась: язык газеты определяется типом издания и жанровой принадлежностью материала, а также редакционной задачей и адресатом публикации.</w:t>
-      </w:r>
-    </w:p>
-    <w:p>
-      <w:pPr>
-        <w:rPr>
-          <w:lang w:val="ru-RU"/>
-        </w:rPr>
-      </w:pPr>
-      <w:r>
-        <w:rPr>
-          <w:lang w:val="ru-RU"/>
-        </w:rPr>
-        <w:t>Практическая значимость работы заключается в разработке конкретных рекомендаций и алгоритмов правки, которые могут быть использованы редакторами в повседневной работе, а также в учебном процессе при подготовке журналистов и редакторов.</w:t>
+        <w:t>Цель работы достигнута: выявлена стилистическая специфика языка газеты и определены направления работы редактора по её учёту. Гипотеза подтвердилась: соотношение стандарта и экспрессии в языке газеты систематически различается по типам изданий — в аналитических газетах преобладает стандарт (канцеляризмы, сложный синтаксис), в бульварных — экспрессия (просторечия, парцелляция, окказионализмы), а внутри каждого типа это соотношение дополнительно модифицируется жанром и адресатом публикации.</w:t>
+      </w:r>
+    </w:p>
+    <w:p>
+      <w:pPr>
+        <w:rPr>
+          <w:lang w:val="ru-RU"/>
+        </w:rPr>
+      </w:pPr>
+      <w:r>
+        <w:rPr>
+          <w:lang w:val="ru-RU"/>
+        </w:rPr>
+        <w:t>Отдельного внимания заслуживает вопрос о влиянии цифровой трансформации на язык газеты. Современная газета существует одновременно в печатной и онлайн-версиях, и это двойное бытование неизбежно влияет на язык. Онлайн-версии газет тяготеют к более коротким текстам, кликабельным заголовкам, упрощённому синтаксису и активному использованию гиперссылок. В перспективе это может привести к дальнейшему расхождению языковых норм печатной и цифровой версий одного и того же издания. Разработанные в настоящей работе рекомендации ориентированы прежде всего на печатные версии газет, однако базовые принципы — учёт типа издания, жанра и аудитории при выборе языковых средств — остаются актуальными и для онлайн-редактирования.
+Практическая значимость работы заключается в разработке конкретных рекомендаций и алгоритмов правки, которые могут быть использованы редакторами в повседневной работе, а также в учебном процессе при подготовке журналистов и редакторов.</w:t>
       </w:r>
     </w:p>
     <w:p>
@@ -17028,7 +16824,7 @@
         <w:rPr>
           <w:lang w:val="ru-RU"/>
         </w:rPr>
-        <w:t>Приложение содержит схематические описания трёх полос проанализированных изданий с разбором визуальных элементов. В печатном экземпляре работы на этих местах размещены сканы соответствующих полос с разметкой стрелками и подписями элементов («врезка», «выносная цитата», «фирменный цвет», «плашка»). Электронная версия работы сопровождает каждую полосу подробным описанием в § 2.4, примеры 1–3.</w:t>
+        <w:t>Приложение содержит схематические описания трёх полос проанализированных изданий с разбором визуальных элементов. В печатном экземпляре работы на этих местах размещены сканы соответствующих полос с разметкой стрелками и подписями элементов («врезка», «выносная цитата», «фирменный цвет», «плашка»). Электронная версия работы сопровождает каждую полосу подробным описанием в § 2.4, примеры 1–3. Для защиты необходимо подготовить полную версию с вклеенными иллюстрациями.</w:t>
       </w:r>
     </w:p>
     <w:p>

</xml_diff>